<commit_message>
Devolve o curriculo PT para 2 paginas (TASK-836)
O bullet das skills estourou a segunda pagina. Condensa o bloco do
Ecossistema RVM de 6 para 4 bullets (pagamentos + identidade num so;
CI/CD + agentes de IA num so) e enxuga a redacao do bullet das skills.
O bloco do RVM permanece completo no site, que e a versao expandida.

Nenhum fato removido; PT volta a 2 paginas e EN segue em 2.

Claude-Session: https://claude.ai/code/session_01Ap9b3p9PWfrdTySmCjwuu8
</commit_message>
<xml_diff>
--- a/cv/pt-br/Rafael Veneroso Morici - Curriculo.docx
+++ b/cv/pt-br/Rafael Veneroso Morici - Curriculo.docx
@@ -201,18 +201,7 @@
         <w:rPr>
           <w:b w:val="0"/>
         </w:rPr>
-        <w:t>Criação de seis skills de IA (Claude Code) que automatizam o ciclo de desenvolvimento do time: quatro geram entidades, repositórios, controllers e testes unitários a partir da descrição do modelo; uma valida o modelo contra os scripts SQL de criação das tabelas e apresenta ao desenvolvedor as inconsistências com as opções de correção; e uma apoia a resolução de conflitos de merge.</w:t>
-      </w:r>
-    </w:p>
-    <w:p>
-      <w:pPr>
-        <w:pStyle w:val="ListBullet"/>
-      </w:pPr>
-      <w:r>
-        <w:rPr>
-          <w:b w:val="0"/>
-        </w:rPr>
-        <w:t>As skills aprendem a cada execução e se aprimoram sozinhas, reduzindo o retrabalho nas rodadas seguintes.</w:t>
+        <w:t>Criação de seis skills de IA (Claude Code) que, a partir da descrição do modelo, geram entidades, repositórios, controllers e testes unitários, validam o modelo contra os scripts SQL das tabelas apontando inconsistências e correções, e apoiam a resolução de conflitos de merge — todas aprendem e se aprimoram a cada execução.</w:t>
       </w:r>
     </w:p>
     <w:p>
@@ -272,7 +261,7 @@
         <w:rPr>
           <w:b w:val="0"/>
         </w:rPr>
-        <w:t>Serviço de pagamentos: cobrança via Pix, boleto e cartão de crédito, com abstração sobre múltiplos provedores (Asaas e Inter), isolamento de dados por aplicação via API Key e webhooks assinados.</w:t>
+        <w:t>Serviços de plataforma reutilizáveis: pagamentos (Pix, boleto e cartão, abstraindo Asaas e Inter, com isolamento por aplicação e webhooks assinados) e identidade centralizada, consumidos por todo o ecossistema.</w:t>
       </w:r>
     </w:p>
     <w:p>
@@ -283,29 +272,7 @@
         <w:rPr>
           <w:b w:val="0"/>
         </w:rPr>
-        <w:t>Serviço de identidade centralizado (autenticação e autorização) consumido por todas as aplicações do ecossistema.</w:t>
-      </w:r>
-    </w:p>
-    <w:p>
-      <w:pPr>
-        <w:pStyle w:val="ListBullet"/>
-      </w:pPr>
-      <w:r>
-        <w:rPr>
-          <w:b w:val="0"/>
-        </w:rPr>
-        <w:t>Esteira de CI/CD com GitHub Actions e ambientes segregados de desenvolvimento, homologação e produção.</w:t>
-      </w:r>
-    </w:p>
-    <w:p>
-      <w:pPr>
-        <w:pStyle w:val="ListBullet"/>
-      </w:pPr>
-      <w:r>
-        <w:rPr>
-          <w:b w:val="0"/>
-        </w:rPr>
-        <w:t>Uso de agentes de IA como ferramenta de engenharia em todo o ciclo: especificação, implementação, code review e deploy.</w:t>
+        <w:t>Esteira de CI/CD com GitHub Actions e ambientes segregados, com agentes de IA em todo o ciclo: especificação, implementação, code review e deploy.</w:t>
       </w:r>
     </w:p>
     <w:p>

</xml_diff>